<commit_message>
Correção do fluxo do caso de uso 02 - Realizar pedido. Close #88
</commit_message>
<xml_diff>
--- a/Requisitos/CSU02 - Realizar pedido.docx
+++ b/Requisitos/CSU02 - Realizar pedido.docx
@@ -1,6 +1,6 @@
 
 <file path=word/document.xml><?xml version="1.0" encoding="utf-8"?>
-<w:document xmlns:wpc="http://schemas.microsoft.com/office/word/2010/wordprocessingCanvas" xmlns:cx="http://schemas.microsoft.com/office/drawing/2014/chartex" xmlns:cx1="http://schemas.microsoft.com/office/drawing/2015/9/8/chartex" xmlns:cx2="http://schemas.microsoft.com/office/drawing/2015/10/21/chartex" xmlns:cx3="http://schemas.microsoft.com/office/drawing/2016/5/9/chartex" xmlns:cx4="http://schemas.microsoft.com/office/drawing/2016/5/10/chartex" xmlns:cx5="http://schemas.microsoft.com/office/drawing/2016/5/11/chartex" xmlns:cx6="http://schemas.microsoft.com/office/drawing/2016/5/12/chartex" xmlns:cx7="http://schemas.microsoft.com/office/drawing/2016/5/13/chartex" xmlns:cx8="http://schemas.microsoft.com/office/drawing/2016/5/14/chartex" xmlns:mc="http://schemas.openxmlformats.org/markup-compatibility/2006" xmlns:aink="http://schemas.microsoft.com/office/drawing/2016/ink" xmlns:am3d="http://schemas.microsoft.com/office/drawing/2017/model3d" xmlns:o="urn:schemas-microsoft-com:office:office" xmlns:oel="http://schemas.microsoft.com/office/2019/extlst" xmlns:r="http://schemas.openxmlformats.org/officeDocument/2006/relationships" xmlns:m="http://schemas.openxmlformats.org/officeDocument/2006/math" xmlns:v="urn:schemas-microsoft-com:vml" xmlns:wp14="http://schemas.microsoft.com/office/word/2010/wordprocessingDrawing" xmlns:wp="http://schemas.openxmlformats.org/drawingml/2006/wordprocessingDrawing" xmlns:w10="urn:schemas-microsoft-com:office:word" xmlns:w="http://schemas.openxmlformats.org/wordprocessingml/2006/main" xmlns:w14="http://schemas.microsoft.com/office/word/2010/wordml" xmlns:w15="http://schemas.microsoft.com/office/word/2012/wordml" xmlns:w16cex="http://schemas.microsoft.com/office/word/2018/wordml/cex" xmlns:w16cid="http://schemas.microsoft.com/office/word/2016/wordml/cid" xmlns:w16="http://schemas.microsoft.com/office/word/2018/wordml" xmlns:w16du="http://schemas.microsoft.com/office/word/2023/wordml/word16du" xmlns:w16sdtdh="http://schemas.microsoft.com/office/word/2020/wordml/sdtdatahash" xmlns:w16sdtfl="http://schemas.microsoft.com/office/word/2024/wordml/sdtformatlock" xmlns:w16se="http://schemas.microsoft.com/office/word/2015/wordml/symex" xmlns:wpg="http://schemas.microsoft.com/office/word/2010/wordprocessingGroup" xmlns:wpi="http://schemas.microsoft.com/office/word/2010/wordprocessingInk" xmlns:wne="http://schemas.microsoft.com/office/word/2006/wordml" xmlns:wps="http://schemas.microsoft.com/office/word/2010/wordprocessingShape" mc:Ignorable="w14 w15 w16se w16cid w16 w16cex w16sdtdh w16sdtfl w16du wp14">
+<w:document xmlns:wpc="http://schemas.microsoft.com/office/word/2010/wordprocessingCanvas" xmlns:cx="http://schemas.microsoft.com/office/drawing/2014/chartex" xmlns:mc="http://schemas.openxmlformats.org/markup-compatibility/2006" xmlns:o="urn:schemas-microsoft-com:office:office" xmlns:r="http://schemas.openxmlformats.org/officeDocument/2006/relationships" xmlns:m="http://schemas.openxmlformats.org/officeDocument/2006/math" xmlns:v="urn:schemas-microsoft-com:vml" xmlns:wp14="http://schemas.microsoft.com/office/word/2010/wordprocessingDrawing" xmlns:wp="http://schemas.openxmlformats.org/drawingml/2006/wordprocessingDrawing" xmlns:w10="urn:schemas-microsoft-com:office:word" xmlns:w="http://schemas.openxmlformats.org/wordprocessingml/2006/main" xmlns:w14="http://schemas.microsoft.com/office/word/2010/wordml" xmlns:w15="http://schemas.microsoft.com/office/word/2012/wordml" xmlns:w16se="http://schemas.microsoft.com/office/word/2015/wordml/symex" xmlns:wpg="http://schemas.microsoft.com/office/word/2010/wordprocessingGroup" xmlns:wpi="http://schemas.microsoft.com/office/word/2010/wordprocessingInk" xmlns:wne="http://schemas.microsoft.com/office/word/2006/wordml" xmlns:wps="http://schemas.microsoft.com/office/word/2010/wordprocessingShape" mc:Ignorable="w14 w15 w16se wp14">
   <w:body>
     <w:p>
       <w:pPr>
@@ -430,9 +430,13 @@
             <w:pPr>
               <w:spacing w:line="360" w:lineRule="auto"/>
               <w:jc w:val="center"/>
-            </w:pPr>
-            <w:r>
-              <w:rPr>
+              <w:rPr>
+                <w:rFonts w:ascii="Times New Roman" w:hAnsi="Times New Roman" w:cs="Times New Roman"/>
+              </w:rPr>
+            </w:pPr>
+            <w:r>
+              <w:rPr>
+                <w:rFonts w:ascii="Times New Roman" w:hAnsi="Times New Roman" w:cs="Times New Roman"/>
                 <w:b/>
                 <w:sz w:val="28"/>
                 <w:szCs w:val="28"/>
@@ -457,6 +461,9 @@
             <w:pPr>
               <w:spacing w:line="360" w:lineRule="auto"/>
               <w:jc w:val="both"/>
+              <w:rPr>
+                <w:rFonts w:ascii="Times New Roman" w:hAnsi="Times New Roman" w:cs="Times New Roman"/>
+              </w:rPr>
             </w:pPr>
             <w:r>
               <w:rPr>
@@ -488,6 +495,9 @@
             <w:pPr>
               <w:spacing w:line="360" w:lineRule="auto"/>
               <w:jc w:val="both"/>
+              <w:rPr>
+                <w:rFonts w:ascii="Times New Roman" w:hAnsi="Times New Roman" w:cs="Times New Roman"/>
+              </w:rPr>
             </w:pPr>
             <w:r>
               <w:rPr>
@@ -499,6 +509,7 @@
             </w:r>
             <w:r>
               <w:rPr>
+                <w:rFonts w:ascii="Times New Roman" w:hAnsi="Times New Roman" w:cs="Times New Roman"/>
                 <w:sz w:val="28"/>
                 <w:szCs w:val="28"/>
               </w:rPr>
@@ -534,6 +545,9 @@
             <w:pPr>
               <w:spacing w:line="360" w:lineRule="auto"/>
               <w:jc w:val="both"/>
+              <w:rPr>
+                <w:rFonts w:ascii="Times New Roman" w:hAnsi="Times New Roman" w:cs="Times New Roman"/>
+              </w:rPr>
             </w:pPr>
             <w:r>
               <w:rPr>
@@ -565,6 +579,9 @@
             <w:pPr>
               <w:spacing w:line="360" w:lineRule="auto"/>
               <w:jc w:val="both"/>
+              <w:rPr>
+                <w:rFonts w:ascii="Times New Roman" w:hAnsi="Times New Roman" w:cs="Times New Roman"/>
+              </w:rPr>
             </w:pPr>
             <w:r>
               <w:rPr>
@@ -576,6 +593,7 @@
             </w:r>
             <w:r>
               <w:rPr>
+                <w:rFonts w:ascii="Times New Roman" w:hAnsi="Times New Roman" w:cs="Times New Roman"/>
                 <w:sz w:val="28"/>
                 <w:szCs w:val="28"/>
               </w:rPr>
@@ -611,6 +629,9 @@
             <w:pPr>
               <w:spacing w:line="360" w:lineRule="auto"/>
               <w:jc w:val="both"/>
+              <w:rPr>
+                <w:rFonts w:ascii="Times New Roman" w:hAnsi="Times New Roman" w:cs="Times New Roman"/>
+              </w:rPr>
             </w:pPr>
             <w:r>
               <w:rPr>
@@ -660,6 +681,9 @@
             <w:pPr>
               <w:spacing w:line="360" w:lineRule="auto"/>
               <w:jc w:val="both"/>
+              <w:rPr>
+                <w:rFonts w:ascii="Times New Roman" w:hAnsi="Times New Roman" w:cs="Times New Roman"/>
+              </w:rPr>
             </w:pPr>
             <w:r>
               <w:rPr>
@@ -671,21 +695,74 @@
             </w:r>
             <w:r>
               <w:rPr>
-                <w:sz w:val="28"/>
-                <w:szCs w:val="28"/>
-              </w:rPr>
-              <w:t xml:space="preserve"> Sistema adiciona pedido ao carrinho de compras. (</w:t>
-            </w:r>
-            <w:r>
-              <w:rPr>
+                <w:rFonts w:ascii="Times New Roman" w:hAnsi="Times New Roman" w:cs="Times New Roman"/>
+                <w:sz w:val="28"/>
+                <w:szCs w:val="28"/>
+              </w:rPr>
+              <w:t xml:space="preserve"> Sistema adiciona pedido ao carrinho de compras</w:t>
+            </w:r>
+            <w:r>
+              <w:rPr>
+                <w:rFonts w:ascii="Times New Roman" w:hAnsi="Times New Roman" w:cs="Times New Roman"/>
+                <w:sz w:val="28"/>
+                <w:szCs w:val="28"/>
+              </w:rPr>
+              <w:t xml:space="preserve"> e </w:t>
+            </w:r>
+            <w:r>
+              <w:rPr>
+                <w:rFonts w:ascii="Times New Roman" w:eastAsia="Times New Roman" w:hAnsi="Times New Roman" w:cs="Times New Roman"/>
+                <w:sz w:val="28"/>
+                <w:szCs w:val="28"/>
+              </w:rPr>
+              <w:t xml:space="preserve">é redirecionado para a </w:t>
+            </w:r>
+            <w:r>
+              <w:rPr>
+                <w:rFonts w:ascii="Times New Roman" w:eastAsia="Times New Roman" w:hAnsi="Times New Roman" w:cs="Times New Roman"/>
                 <w:color w:val="FF0000"/>
                 <w:sz w:val="28"/>
                 <w:szCs w:val="28"/>
               </w:rPr>
-              <w:t>Tela 06</w:t>
-            </w:r>
-            <w:r>
-              <w:rPr>
+              <w:t>Tela 05</w:t>
+            </w:r>
+            <w:r>
+              <w:rPr>
+                <w:rFonts w:ascii="Times New Roman" w:hAnsi="Times New Roman" w:cs="Times New Roman"/>
+                <w:sz w:val="28"/>
+                <w:szCs w:val="28"/>
+              </w:rPr>
+              <w:t>.</w:t>
+            </w:r>
+          </w:p>
+          <w:p>
+            <w:pPr>
+              <w:spacing w:line="360" w:lineRule="auto"/>
+              <w:jc w:val="both"/>
+              <w:rPr>
+                <w:rFonts w:ascii="Times New Roman" w:hAnsi="Times New Roman" w:cs="Times New Roman"/>
+              </w:rPr>
+            </w:pPr>
+            <w:r>
+              <w:rPr>
+                <w:rFonts w:ascii="Times New Roman" w:eastAsia="Times New Roman" w:hAnsi="Times New Roman" w:cs="Times New Roman"/>
+                <w:sz w:val="28"/>
+                <w:szCs w:val="28"/>
+              </w:rPr>
+              <w:t>7. Ator pressiona o ícone do carrinho de compras. (</w:t>
+            </w:r>
+            <w:r>
+              <w:rPr>
+                <w:rFonts w:ascii="Times New Roman" w:eastAsia="Times New Roman" w:hAnsi="Times New Roman" w:cs="Times New Roman"/>
+                <w:color w:val="FF0000"/>
+                <w:sz w:val="28"/>
+                <w:szCs w:val="28"/>
+              </w:rPr>
+              <w:t>Tela 05</w:t>
+            </w:r>
+            <w:r>
+              <w:rPr>
+                <w:rFonts w:ascii="Times New Roman" w:eastAsia="Times New Roman" w:hAnsi="Times New Roman" w:cs="Times New Roman"/>
                 <w:sz w:val="28"/>
                 <w:szCs w:val="28"/>
               </w:rPr>
@@ -696,27 +773,46 @@
             <w:pPr>
               <w:spacing w:line="360" w:lineRule="auto"/>
               <w:jc w:val="both"/>
-            </w:pPr>
-            <w:r>
-              <w:rPr>
-                <w:rFonts w:ascii="Times New Roman" w:eastAsia="Times New Roman" w:hAnsi="Times New Roman" w:cs="Times New Roman"/>
-                <w:sz w:val="28"/>
-                <w:szCs w:val="28"/>
-              </w:rPr>
-              <w:t>7. Ator pressiona o ícone do carrinho de compras. (</w:t>
-            </w:r>
-            <w:r>
-              <w:rPr>
-                <w:rFonts w:ascii="Times New Roman" w:eastAsia="Times New Roman" w:hAnsi="Times New Roman" w:cs="Times New Roman"/>
+              <w:rPr>
+                <w:rFonts w:ascii="Times New Roman" w:hAnsi="Times New Roman" w:cs="Times New Roman"/>
+              </w:rPr>
+            </w:pPr>
+            <w:r>
+              <w:rPr>
+                <w:rFonts w:ascii="Times New Roman" w:eastAsia="Times New Roman" w:hAnsi="Times New Roman" w:cs="Times New Roman"/>
+                <w:sz w:val="28"/>
+                <w:szCs w:val="28"/>
+              </w:rPr>
+              <w:t>8</w:t>
+            </w:r>
+            <w:r>
+              <w:rPr>
+                <w:rFonts w:ascii="Times New Roman" w:eastAsia="Times New Roman" w:hAnsi="Times New Roman" w:cs="Times New Roman"/>
+                <w:sz w:val="28"/>
+                <w:szCs w:val="28"/>
+              </w:rPr>
+              <w:t xml:space="preserve">. </w:t>
+            </w:r>
+            <w:r>
+              <w:rPr>
+                <w:rFonts w:ascii="Times New Roman" w:hAnsi="Times New Roman" w:cs="Times New Roman"/>
+                <w:sz w:val="28"/>
+                <w:szCs w:val="28"/>
+              </w:rPr>
+              <w:t>Sistema exibe menu do carrinho de compras. (</w:t>
+            </w:r>
+            <w:r>
+              <w:rPr>
+                <w:rFonts w:ascii="Times New Roman" w:hAnsi="Times New Roman" w:cs="Times New Roman"/>
                 <w:color w:val="FF0000"/>
                 <w:sz w:val="28"/>
                 <w:szCs w:val="28"/>
               </w:rPr>
-              <w:t>Tela 06</w:t>
-            </w:r>
-            <w:r>
-              <w:rPr>
-                <w:rFonts w:ascii="Times New Roman" w:eastAsia="Times New Roman" w:hAnsi="Times New Roman" w:cs="Times New Roman"/>
+              <w:t>Tela 07</w:t>
+            </w:r>
+            <w:r>
+              <w:rPr>
+                <w:rFonts w:ascii="Times New Roman" w:hAnsi="Times New Roman" w:cs="Times New Roman"/>
                 <w:sz w:val="28"/>
                 <w:szCs w:val="28"/>
               </w:rPr>
@@ -727,49 +823,25 @@
             <w:pPr>
               <w:spacing w:line="360" w:lineRule="auto"/>
               <w:jc w:val="both"/>
-            </w:pPr>
-            <w:r>
-              <w:rPr>
-                <w:rFonts w:ascii="Times New Roman" w:eastAsia="Times New Roman" w:hAnsi="Times New Roman" w:cs="Times New Roman"/>
-                <w:sz w:val="28"/>
-                <w:szCs w:val="28"/>
-              </w:rPr>
-              <w:t xml:space="preserve">8. </w:t>
-            </w:r>
-            <w:r>
-              <w:rPr>
-                <w:sz w:val="28"/>
-                <w:szCs w:val="28"/>
-              </w:rPr>
-              <w:t>Sistema exibe menu do carrinho de compras. (</w:t>
-            </w:r>
-            <w:r>
-              <w:rPr>
-                <w:color w:val="FF0000"/>
-                <w:sz w:val="28"/>
-                <w:szCs w:val="28"/>
-              </w:rPr>
-              <w:t>Tela 07</w:t>
-            </w:r>
-            <w:r>
-              <w:rPr>
-                <w:sz w:val="28"/>
-                <w:szCs w:val="28"/>
-              </w:rPr>
-              <w:t>)</w:t>
-            </w:r>
-          </w:p>
-          <w:p>
-            <w:pPr>
-              <w:spacing w:line="360" w:lineRule="auto"/>
-              <w:jc w:val="both"/>
-            </w:pPr>
-            <w:r>
-              <w:rPr>
-                <w:sz w:val="28"/>
-                <w:szCs w:val="28"/>
-              </w:rPr>
-              <w:t>9.</w:t>
+              <w:rPr>
+                <w:rFonts w:ascii="Times New Roman" w:hAnsi="Times New Roman" w:cs="Times New Roman"/>
+              </w:rPr>
+            </w:pPr>
+            <w:r>
+              <w:rPr>
+                <w:rFonts w:ascii="Times New Roman" w:hAnsi="Times New Roman" w:cs="Times New Roman"/>
+                <w:sz w:val="28"/>
+                <w:szCs w:val="28"/>
+              </w:rPr>
+              <w:t>9</w:t>
+            </w:r>
+            <w:r>
+              <w:rPr>
+                <w:rFonts w:ascii="Times New Roman" w:hAnsi="Times New Roman" w:cs="Times New Roman"/>
+                <w:sz w:val="28"/>
+                <w:szCs w:val="28"/>
+              </w:rPr>
+              <w:t>.</w:t>
             </w:r>
             <w:r>
               <w:rPr>
@@ -822,7 +894,17 @@
                 <w:sz w:val="28"/>
                 <w:szCs w:val="28"/>
               </w:rPr>
-              <w:t>Tela 07</w:t>
+              <w:t xml:space="preserve">Tela </w:t>
+            </w:r>
+            <w:r>
+              <w:rPr>
+                <w:rFonts w:ascii="Times New Roman" w:eastAsia="Times New Roman" w:hAnsi="Times New Roman" w:cs="Times New Roman"/>
+                <w:color w:val="FF0000"/>
+                <w:sz w:val="28"/>
+                <w:szCs w:val="28"/>
+              </w:rPr>
+              <w:lastRenderedPageBreak/>
+              <w:t>07</w:t>
             </w:r>
             <w:r>
               <w:rPr>
@@ -837,15 +919,25 @@
             <w:pPr>
               <w:spacing w:line="360" w:lineRule="auto"/>
               <w:jc w:val="both"/>
-            </w:pPr>
-            <w:r>
-              <w:rPr>
-                <w:rFonts w:ascii="Times New Roman" w:eastAsia="Times New Roman" w:hAnsi="Times New Roman" w:cs="Times New Roman"/>
-                <w:sz w:val="28"/>
-                <w:szCs w:val="28"/>
-              </w:rPr>
-              <w:lastRenderedPageBreak/>
-              <w:t>10. Ator pressiona botão “</w:t>
+              <w:rPr>
+                <w:rFonts w:ascii="Times New Roman" w:hAnsi="Times New Roman" w:cs="Times New Roman"/>
+              </w:rPr>
+            </w:pPr>
+            <w:r>
+              <w:rPr>
+                <w:rFonts w:ascii="Times New Roman" w:eastAsia="Times New Roman" w:hAnsi="Times New Roman" w:cs="Times New Roman"/>
+                <w:sz w:val="28"/>
+                <w:szCs w:val="28"/>
+              </w:rPr>
+              <w:t>10</w:t>
+            </w:r>
+            <w:r>
+              <w:rPr>
+                <w:rFonts w:ascii="Times New Roman" w:eastAsia="Times New Roman" w:hAnsi="Times New Roman" w:cs="Times New Roman"/>
+                <w:sz w:val="28"/>
+                <w:szCs w:val="28"/>
+              </w:rPr>
+              <w:t>. Ator pressiona botão “</w:t>
             </w:r>
             <w:r>
               <w:rPr>
@@ -887,13 +979,25 @@
             <w:pPr>
               <w:spacing w:line="360" w:lineRule="auto"/>
               <w:jc w:val="both"/>
-            </w:pPr>
-            <w:r>
-              <w:rPr>
-                <w:sz w:val="28"/>
-                <w:szCs w:val="28"/>
-              </w:rPr>
-              <w:t xml:space="preserve">11. Sistema grava dados informados em meio persistente. </w:t>
+              <w:rPr>
+                <w:rFonts w:ascii="Times New Roman" w:hAnsi="Times New Roman" w:cs="Times New Roman"/>
+              </w:rPr>
+            </w:pPr>
+            <w:r>
+              <w:rPr>
+                <w:rFonts w:ascii="Times New Roman" w:hAnsi="Times New Roman" w:cs="Times New Roman"/>
+                <w:sz w:val="28"/>
+                <w:szCs w:val="28"/>
+              </w:rPr>
+              <w:t>11</w:t>
+            </w:r>
+            <w:r>
+              <w:rPr>
+                <w:rFonts w:ascii="Times New Roman" w:hAnsi="Times New Roman" w:cs="Times New Roman"/>
+                <w:sz w:val="28"/>
+                <w:szCs w:val="28"/>
+              </w:rPr>
+              <w:t xml:space="preserve">. Sistema grava dados informados em meio persistente. </w:t>
             </w:r>
             <w:r>
               <w:rPr>
@@ -938,15 +1042,19 @@
             <w:pPr>
               <w:spacing w:line="360" w:lineRule="auto"/>
               <w:jc w:val="center"/>
-            </w:pPr>
-            <w:r>
-              <w:rPr>
+              <w:rPr>
+                <w:rFonts w:ascii="Times New Roman" w:hAnsi="Times New Roman" w:cs="Times New Roman"/>
+              </w:rPr>
+            </w:pPr>
+            <w:r>
+              <w:rPr>
+                <w:rFonts w:ascii="Times New Roman" w:hAnsi="Times New Roman" w:cs="Times New Roman"/>
                 <w:b/>
                 <w:sz w:val="28"/>
                 <w:szCs w:val="28"/>
               </w:rPr>
               <w:lastRenderedPageBreak/>
-              <w:t>Fluxos de Exceção</w:t>
+              <w:t>Fluxos Alternativo</w:t>
             </w:r>
           </w:p>
         </w:tc>
@@ -966,33 +1074,22 @@
             <w:pPr>
               <w:spacing w:line="360" w:lineRule="auto"/>
               <w:jc w:val="both"/>
-            </w:pPr>
-            <w:r>
-              <w:rPr>
+              <w:rPr>
+                <w:rFonts w:ascii="Times New Roman" w:hAnsi="Times New Roman" w:cs="Times New Roman"/>
+              </w:rPr>
+            </w:pPr>
+            <w:r>
+              <w:rPr>
+                <w:rFonts w:ascii="Times New Roman" w:hAnsi="Times New Roman" w:cs="Times New Roman"/>
                 <w:b/>
                 <w:sz w:val="28"/>
                 <w:szCs w:val="28"/>
               </w:rPr>
-              <w:t xml:space="preserve">Passo </w:t>
-            </w:r>
-            <w:r>
-              <w:rPr>
-                <w:b/>
-                <w:sz w:val="28"/>
-                <w:szCs w:val="28"/>
-              </w:rPr>
-              <w:t>8</w:t>
-            </w:r>
-            <w:r>
-              <w:rPr>
-                <w:b/>
-                <w:sz w:val="28"/>
-                <w:szCs w:val="28"/>
-              </w:rPr>
-              <w:t xml:space="preserve">: </w:t>
-            </w:r>
-            <w:r>
-              <w:rPr>
+              <w:t xml:space="preserve">Passo 8: </w:t>
+            </w:r>
+            <w:r>
+              <w:rPr>
+                <w:rFonts w:ascii="Times New Roman" w:hAnsi="Times New Roman" w:cs="Times New Roman"/>
                 <w:sz w:val="28"/>
                 <w:szCs w:val="28"/>
               </w:rPr>
@@ -1000,6 +1097,7 @@
             </w:r>
             <w:r>
               <w:rPr>
+                <w:rFonts w:ascii="Times New Roman" w:hAnsi="Times New Roman" w:cs="Times New Roman"/>
                 <w:b/>
                 <w:bCs/>
                 <w:sz w:val="28"/>
@@ -1009,27 +1107,23 @@
             </w:r>
             <w:r>
               <w:rPr>
-                <w:sz w:val="28"/>
-                <w:szCs w:val="28"/>
-              </w:rPr>
-              <w:t>”, o pedido</w:t>
-            </w:r>
-            <w:r>
-              <w:rPr>
-                <w:sz w:val="28"/>
-                <w:szCs w:val="28"/>
-              </w:rPr>
-              <w:t xml:space="preserve"> cancel</w:t>
-            </w:r>
-            <w:r>
-              <w:rPr>
-                <w:sz w:val="28"/>
-                <w:szCs w:val="28"/>
-              </w:rPr>
-              <w:t>ado</w:t>
-            </w:r>
-            <w:r>
-              <w:rPr>
+                <w:rFonts w:ascii="Times New Roman" w:hAnsi="Times New Roman" w:cs="Times New Roman"/>
+                <w:sz w:val="28"/>
+                <w:szCs w:val="28"/>
+              </w:rPr>
+              <w:t>”</w:t>
+            </w:r>
+            <w:r>
+              <w:rPr>
+                <w:rFonts w:ascii="Times New Roman" w:hAnsi="Times New Roman" w:cs="Times New Roman"/>
+                <w:sz w:val="28"/>
+                <w:szCs w:val="28"/>
+              </w:rPr>
+              <w:t xml:space="preserve"> em algum dos itens, irá aparecer um pop-up perguntando: “Deseja remover o item?”, com as opções sim ou não</w:t>
+            </w:r>
+            <w:r>
+              <w:rPr>
+                <w:rFonts w:ascii="Times New Roman" w:hAnsi="Times New Roman" w:cs="Times New Roman"/>
                 <w:sz w:val="28"/>
                 <w:szCs w:val="28"/>
               </w:rPr>
@@ -1074,6 +1168,9 @@
       <w:pPr>
         <w:spacing w:line="360" w:lineRule="auto"/>
         <w:jc w:val="center"/>
+        <w:rPr>
+          <w:rFonts w:ascii="Times New Roman" w:hAnsi="Times New Roman" w:cs="Times New Roman"/>
+        </w:rPr>
       </w:pPr>
       <w:r>
         <w:rPr>
@@ -1111,6 +1208,9 @@
             <w:pPr>
               <w:spacing w:line="360" w:lineRule="auto"/>
               <w:jc w:val="center"/>
+              <w:rPr>
+                <w:rFonts w:ascii="Times New Roman" w:hAnsi="Times New Roman" w:cs="Times New Roman"/>
+              </w:rPr>
             </w:pPr>
             <w:r>
               <w:rPr>
@@ -1136,6 +1236,9 @@
             <w:pPr>
               <w:spacing w:line="360" w:lineRule="auto"/>
               <w:jc w:val="center"/>
+              <w:rPr>
+                <w:rFonts w:ascii="Times New Roman" w:hAnsi="Times New Roman" w:cs="Times New Roman"/>
+              </w:rPr>
             </w:pPr>
             <w:r>
               <w:rPr>
@@ -1161,6 +1264,9 @@
             <w:pPr>
               <w:spacing w:line="360" w:lineRule="auto"/>
               <w:jc w:val="center"/>
+              <w:rPr>
+                <w:rFonts w:ascii="Times New Roman" w:hAnsi="Times New Roman" w:cs="Times New Roman"/>
+              </w:rPr>
             </w:pPr>
             <w:r>
               <w:rPr>
@@ -1356,11 +1462,104 @@
             </w:r>
             <w:r>
               <w:rPr>
+                <w:rFonts w:ascii="Times New Roman" w:hAnsi="Times New Roman" w:cs="Times New Roman"/>
                 <w:bCs/>
                 <w:sz w:val="28"/>
                 <w:szCs w:val="28"/>
               </w:rPr>
               <w:t>Exceção</w:t>
+            </w:r>
+          </w:p>
+        </w:tc>
+      </w:tr>
+      <w:tr>
+        <w:tc>
+          <w:tcPr>
+            <w:tcW w:w="3209" w:type="dxa"/>
+            <w:tcBorders>
+              <w:top w:val="single" w:sz="4" w:space="0" w:color="000000"/>
+              <w:left w:val="single" w:sz="4" w:space="0" w:color="000000"/>
+              <w:bottom w:val="single" w:sz="4" w:space="0" w:color="000000"/>
+              <w:right w:val="single" w:sz="4" w:space="0" w:color="000000"/>
+            </w:tcBorders>
+          </w:tcPr>
+          <w:p>
+            <w:pPr>
+              <w:spacing w:line="360" w:lineRule="auto"/>
+              <w:jc w:val="center"/>
+              <w:rPr>
+                <w:rFonts w:ascii="Times New Roman" w:eastAsia="Times New Roman" w:hAnsi="Times New Roman" w:cs="Times New Roman"/>
+                <w:sz w:val="28"/>
+                <w:szCs w:val="28"/>
+              </w:rPr>
+            </w:pPr>
+            <w:r>
+              <w:rPr>
+                <w:rFonts w:ascii="Times New Roman" w:eastAsia="Times New Roman" w:hAnsi="Times New Roman" w:cs="Times New Roman"/>
+                <w:sz w:val="28"/>
+                <w:szCs w:val="28"/>
+              </w:rPr>
+              <w:t>23/07/2025</w:t>
+            </w:r>
+          </w:p>
+        </w:tc>
+        <w:tc>
+          <w:tcPr>
+            <w:tcW w:w="3209" w:type="dxa"/>
+            <w:tcBorders>
+              <w:top w:val="single" w:sz="4" w:space="0" w:color="000000"/>
+              <w:left w:val="single" w:sz="4" w:space="0" w:color="000000"/>
+              <w:bottom w:val="single" w:sz="4" w:space="0" w:color="000000"/>
+              <w:right w:val="single" w:sz="4" w:space="0" w:color="000000"/>
+            </w:tcBorders>
+          </w:tcPr>
+          <w:p>
+            <w:pPr>
+              <w:spacing w:line="360" w:lineRule="auto"/>
+              <w:jc w:val="center"/>
+              <w:rPr>
+                <w:rFonts w:ascii="Times New Roman" w:eastAsia="Times New Roman" w:hAnsi="Times New Roman" w:cs="Times New Roman"/>
+                <w:sz w:val="28"/>
+                <w:szCs w:val="28"/>
+              </w:rPr>
+            </w:pPr>
+            <w:r>
+              <w:rPr>
+                <w:rFonts w:ascii="Times New Roman" w:eastAsia="Times New Roman" w:hAnsi="Times New Roman" w:cs="Times New Roman"/>
+                <w:sz w:val="28"/>
+                <w:szCs w:val="28"/>
+              </w:rPr>
+              <w:t>Pedro Henrique</w:t>
+            </w:r>
+          </w:p>
+        </w:tc>
+        <w:tc>
+          <w:tcPr>
+            <w:tcW w:w="3210" w:type="dxa"/>
+            <w:tcBorders>
+              <w:top w:val="single" w:sz="4" w:space="0" w:color="000000"/>
+              <w:left w:val="single" w:sz="4" w:space="0" w:color="000000"/>
+              <w:bottom w:val="single" w:sz="4" w:space="0" w:color="000000"/>
+              <w:right w:val="single" w:sz="4" w:space="0" w:color="000000"/>
+            </w:tcBorders>
+          </w:tcPr>
+          <w:p>
+            <w:pPr>
+              <w:spacing w:line="360" w:lineRule="auto"/>
+              <w:jc w:val="center"/>
+              <w:rPr>
+                <w:rFonts w:ascii="Times New Roman" w:eastAsia="Times New Roman" w:hAnsi="Times New Roman" w:cs="Times New Roman"/>
+                <w:sz w:val="28"/>
+                <w:szCs w:val="28"/>
+              </w:rPr>
+            </w:pPr>
+            <w:r>
+              <w:rPr>
+                <w:rFonts w:ascii="Times New Roman" w:eastAsia="Times New Roman" w:hAnsi="Times New Roman" w:cs="Times New Roman"/>
+                <w:sz w:val="28"/>
+                <w:szCs w:val="28"/>
+              </w:rPr>
+              <w:t>Pequenas correções do fluxo</w:t>
             </w:r>
           </w:p>
         </w:tc>
@@ -1373,6 +1572,8 @@
           <w:u w:val="single"/>
         </w:rPr>
       </w:pPr>
+      <w:bookmarkStart w:id="1" w:name="_GoBack"/>
+      <w:bookmarkEnd w:id="1"/>
     </w:p>
     <w:sectPr>
       <w:pgSz w:w="11906" w:h="16838"/>
@@ -1386,7 +1587,7 @@
 </file>
 
 <file path=word/styles.xml><?xml version="1.0" encoding="utf-8"?>
-<w:styles xmlns:mc="http://schemas.openxmlformats.org/markup-compatibility/2006" xmlns:r="http://schemas.openxmlformats.org/officeDocument/2006/relationships" xmlns:w="http://schemas.openxmlformats.org/wordprocessingml/2006/main" xmlns:w14="http://schemas.microsoft.com/office/word/2010/wordml" xmlns:w15="http://schemas.microsoft.com/office/word/2012/wordml" xmlns:w16cex="http://schemas.microsoft.com/office/word/2018/wordml/cex" xmlns:w16cid="http://schemas.microsoft.com/office/word/2016/wordml/cid" xmlns:w16="http://schemas.microsoft.com/office/word/2018/wordml" xmlns:w16du="http://schemas.microsoft.com/office/word/2023/wordml/word16du" xmlns:w16sdtdh="http://schemas.microsoft.com/office/word/2020/wordml/sdtdatahash" xmlns:w16sdtfl="http://schemas.microsoft.com/office/word/2024/wordml/sdtformatlock" xmlns:w16se="http://schemas.microsoft.com/office/word/2015/wordml/symex" mc:Ignorable="w14 w15 w16se w16cid w16 w16cex w16sdtdh w16sdtfl w16du">
+<w:styles xmlns:mc="http://schemas.openxmlformats.org/markup-compatibility/2006" xmlns:r="http://schemas.openxmlformats.org/officeDocument/2006/relationships" xmlns:w="http://schemas.openxmlformats.org/wordprocessingml/2006/main" xmlns:w14="http://schemas.microsoft.com/office/word/2010/wordml" xmlns:w15="http://schemas.microsoft.com/office/word/2012/wordml" xmlns:w16se="http://schemas.microsoft.com/office/word/2015/wordml/symex" mc:Ignorable="w14 w15 w16se">
   <w:docDefaults>
     <w:rPrDefault>
       <w:rPr>
@@ -1404,7 +1605,7 @@
       </w:pPr>
     </w:pPrDefault>
   </w:docDefaults>
-  <w:latentStyles w:defLockedState="0" w:defUIPriority="99" w:defSemiHidden="0" w:defUnhideWhenUsed="0" w:defQFormat="0" w:count="376">
+  <w:latentStyles w:defLockedState="0" w:defUIPriority="99" w:defSemiHidden="0" w:defUnhideWhenUsed="0" w:defQFormat="0" w:count="371">
     <w:lsdException w:name="Normal" w:uiPriority="0" w:qFormat="1"/>
     <w:lsdException w:name="heading 1" w:uiPriority="9" w:qFormat="1"/>
     <w:lsdException w:name="heading 2" w:semiHidden="1" w:uiPriority="9" w:unhideWhenUsed="1" w:qFormat="1"/>
@@ -1776,11 +1977,6 @@
     <w:lsdException w:name="List Table 5 Dark Accent 6" w:uiPriority="50"/>
     <w:lsdException w:name="List Table 6 Colorful Accent 6" w:uiPriority="51"/>
     <w:lsdException w:name="List Table 7 Colorful Accent 6" w:uiPriority="52"/>
-    <w:lsdException w:name="Mention" w:semiHidden="1" w:unhideWhenUsed="1"/>
-    <w:lsdException w:name="Smart Hyperlink" w:semiHidden="1" w:unhideWhenUsed="1"/>
-    <w:lsdException w:name="Hashtag" w:semiHidden="1" w:unhideWhenUsed="1"/>
-    <w:lsdException w:name="Unresolved Mention" w:semiHidden="1" w:unhideWhenUsed="1"/>
-    <w:lsdException w:name="Smart Link" w:semiHidden="1" w:unhideWhenUsed="1"/>
   </w:latentStyles>
   <w:style w:type="paragraph" w:default="1" w:styleId="Normal">
     <w:name w:val="Normal"/>
@@ -2025,6 +2221,7 @@
   <w:style w:type="character" w:default="1" w:styleId="Fontepargpadro">
     <w:name w:val="Default Paragraph Font"/>
     <w:uiPriority w:val="1"/>
+    <w:semiHidden/>
     <w:unhideWhenUsed/>
   </w:style>
   <w:style w:type="table" w:default="1" w:styleId="Tabelanormal">

</xml_diff>